<commit_message>
Optimize report figures so DOCX deliverable is under 2048 KB limit (1891 KB)
</commit_message>
<xml_diff>
--- a/Agribusiness_Exploratory_Data_Analysis_and_Visualization_Report.docx
+++ b/Agribusiness_Exploratory_Data_Analysis_and_Visualization_Report.docx
@@ -6096,7 +6096,7 @@
       <w:r>
         <w:drawing>
           <wp:inline xmlns:a="http://schemas.openxmlformats.org/drawingml/2006/main" xmlns:pic="http://schemas.openxmlformats.org/drawingml/2006/picture">
-            <wp:extent cx="5852160" cy="3881217"/>
+            <wp:extent cx="5852160" cy="3890487"/>
             <wp:docPr id="1" name="Picture 1"/>
             <wp:cNvGraphicFramePr>
               <a:graphicFrameLocks noChangeAspect="1"/>
@@ -6117,7 +6117,7 @@
                   <pic:spPr>
                     <a:xfrm>
                       <a:off x="0" y="0"/>
-                      <a:ext cx="5852160" cy="3881217"/>
+                      <a:ext cx="5852160" cy="3890487"/>
                     </a:xfrm>
                     <a:prstGeom prst="rect"/>
                   </pic:spPr>
@@ -6175,7 +6175,7 @@
       <w:r>
         <w:drawing>
           <wp:inline xmlns:a="http://schemas.openxmlformats.org/drawingml/2006/main" xmlns:pic="http://schemas.openxmlformats.org/drawingml/2006/picture">
-            <wp:extent cx="5852160" cy="3881217"/>
+            <wp:extent cx="5852160" cy="3888304"/>
             <wp:docPr id="2" name="Picture 2"/>
             <wp:cNvGraphicFramePr>
               <a:graphicFrameLocks noChangeAspect="1"/>
@@ -6196,7 +6196,7 @@
                   <pic:spPr>
                     <a:xfrm>
                       <a:off x="0" y="0"/>
-                      <a:ext cx="5852160" cy="3881217"/>
+                      <a:ext cx="5852160" cy="3888304"/>
                     </a:xfrm>
                     <a:prstGeom prst="rect"/>
                   </pic:spPr>
@@ -6262,7 +6262,7 @@
       <w:r>
         <w:drawing>
           <wp:inline xmlns:a="http://schemas.openxmlformats.org/drawingml/2006/main" xmlns:pic="http://schemas.openxmlformats.org/drawingml/2006/picture">
-            <wp:extent cx="5852160" cy="3142462"/>
+            <wp:extent cx="5852160" cy="3145864"/>
             <wp:docPr id="3" name="Picture 3"/>
             <wp:cNvGraphicFramePr>
               <a:graphicFrameLocks noChangeAspect="1"/>
@@ -6283,7 +6283,7 @@
                   <pic:spPr>
                     <a:xfrm>
                       <a:off x="0" y="0"/>
-                      <a:ext cx="5852160" cy="3142462"/>
+                      <a:ext cx="5852160" cy="3145864"/>
                     </a:xfrm>
                     <a:prstGeom prst="rect"/>
                   </pic:spPr>
@@ -6349,7 +6349,7 @@
       <w:r>
         <w:drawing>
           <wp:inline xmlns:a="http://schemas.openxmlformats.org/drawingml/2006/main" xmlns:pic="http://schemas.openxmlformats.org/drawingml/2006/picture">
-            <wp:extent cx="5852160" cy="3881217"/>
+            <wp:extent cx="5852160" cy="3888304"/>
             <wp:docPr id="4" name="Picture 4"/>
             <wp:cNvGraphicFramePr>
               <a:graphicFrameLocks noChangeAspect="1"/>
@@ -6370,7 +6370,7 @@
                   <pic:spPr>
                     <a:xfrm>
                       <a:off x="0" y="0"/>
-                      <a:ext cx="5852160" cy="3881217"/>
+                      <a:ext cx="5852160" cy="3888304"/>
                     </a:xfrm>
                     <a:prstGeom prst="rect"/>
                   </pic:spPr>
@@ -6428,7 +6428,7 @@
       <w:r>
         <w:drawing>
           <wp:inline xmlns:a="http://schemas.openxmlformats.org/drawingml/2006/main" xmlns:pic="http://schemas.openxmlformats.org/drawingml/2006/picture">
-            <wp:extent cx="5852160" cy="3142462"/>
+            <wp:extent cx="5852160" cy="3145864"/>
             <wp:docPr id="5" name="Picture 5"/>
             <wp:cNvGraphicFramePr>
               <a:graphicFrameLocks noChangeAspect="1"/>
@@ -6449,7 +6449,7 @@
                   <pic:spPr>
                     <a:xfrm>
                       <a:off x="0" y="0"/>
-                      <a:ext cx="5852160" cy="3142462"/>
+                      <a:ext cx="5852160" cy="3145864"/>
                     </a:xfrm>
                     <a:prstGeom prst="rect"/>
                   </pic:spPr>
@@ -6515,7 +6515,7 @@
       <w:r>
         <w:drawing>
           <wp:inline xmlns:a="http://schemas.openxmlformats.org/drawingml/2006/main" xmlns:pic="http://schemas.openxmlformats.org/drawingml/2006/picture">
-            <wp:extent cx="5852160" cy="2483202"/>
+            <wp:extent cx="5852160" cy="2483586"/>
             <wp:docPr id="6" name="Picture 6"/>
             <wp:cNvGraphicFramePr>
               <a:graphicFrameLocks noChangeAspect="1"/>
@@ -6536,7 +6536,7 @@
                   <pic:spPr>
                     <a:xfrm>
                       <a:off x="0" y="0"/>
-                      <a:ext cx="5852160" cy="2483202"/>
+                      <a:ext cx="5852160" cy="2483586"/>
                     </a:xfrm>
                     <a:prstGeom prst="rect"/>
                   </pic:spPr>
@@ -6602,7 +6602,7 @@
       <w:r>
         <w:drawing>
           <wp:inline xmlns:a="http://schemas.openxmlformats.org/drawingml/2006/main" xmlns:pic="http://schemas.openxmlformats.org/drawingml/2006/picture">
-            <wp:extent cx="5852160" cy="2532807"/>
+            <wp:extent cx="5852160" cy="2531879"/>
             <wp:docPr id="7" name="Picture 7"/>
             <wp:cNvGraphicFramePr>
               <a:graphicFrameLocks noChangeAspect="1"/>
@@ -6623,7 +6623,7 @@
                   <pic:spPr>
                     <a:xfrm>
                       <a:off x="0" y="0"/>
-                      <a:ext cx="5852160" cy="2532807"/>
+                      <a:ext cx="5852160" cy="2531879"/>
                     </a:xfrm>
                     <a:prstGeom prst="rect"/>
                   </pic:spPr>
@@ -6741,7 +6741,7 @@
       <w:r>
         <w:drawing>
           <wp:inline xmlns:a="http://schemas.openxmlformats.org/drawingml/2006/main" xmlns:pic="http://schemas.openxmlformats.org/drawingml/2006/picture">
-            <wp:extent cx="5852160" cy="3909735"/>
+            <wp:extent cx="5852160" cy="3910176"/>
             <wp:docPr id="8" name="Picture 8"/>
             <wp:cNvGraphicFramePr>
               <a:graphicFrameLocks noChangeAspect="1"/>
@@ -6762,7 +6762,7 @@
                   <pic:spPr>
                     <a:xfrm>
                       <a:off x="0" y="0"/>
-                      <a:ext cx="5852160" cy="3909735"/>
+                      <a:ext cx="5852160" cy="3910176"/>
                     </a:xfrm>
                     <a:prstGeom prst="rect"/>
                   </pic:spPr>

</xml_diff>